<commit_message>
Add ZIP archive and update DOCX file
Added Ekip_CodeAvengers_Sofia9.zip and updated Vizitka_CodeAvengers_Sofia9.docx with new content.
</commit_message>
<xml_diff>
--- a/Ekip_CodeAvengers_Sofia9/Vizitka_CodeAvengers_Sofia9.docx
+++ b/Ekip_CodeAvengers_Sofia9/Vizitka_CodeAvengers_Sofia9.docx
@@ -67,7 +67,7 @@
           <w:b/>
           <w:bCs/>
         </w:rPr>
-        <w:t xml:space="preserve"> IT Знайко  и IT Знайко+, 2026</w:t>
+        <w:t xml:space="preserve"> IT Знайко, 2026</w:t>
       </w:r>
     </w:p>
     <w:p/>
@@ -180,7 +180,7 @@
     <w:p>
       <w:pPr>
         <w:rPr>
-          <w:lang w:val="bg-BG"/>
+          <w:lang w:val="en-US"/>
         </w:rPr>
       </w:pPr>
       <w:r>
@@ -229,43 +229,6 @@
           <w:szCs w:val="24"/>
           <w:lang w:val="bg-BG"/>
         </w:rPr>
-        <w:t xml:space="preserve">Адрес на нашият проект в </w:t>
-      </w:r>
-      <w:r>
-        <w:rPr>
-          <w:b/>
-          <w:bCs/>
-          <w:sz w:val="24"/>
-          <w:szCs w:val="24"/>
-          <w:lang w:val="en-US"/>
-        </w:rPr>
-        <w:t xml:space="preserve">GitHub: </w:t>
-      </w:r>
-      <w:r>
-        <w:rPr>
-          <w:sz w:val="24"/>
-          <w:szCs w:val="24"/>
-          <w:lang w:val="en-US"/>
-        </w:rPr>
-        <w:t>https://github.com/AdamBikov/UNESCO-Bulgaria</w:t>
-      </w:r>
-    </w:p>
-    <w:p>
-      <w:pPr>
-        <w:rPr>
-          <w:sz w:val="24"/>
-          <w:szCs w:val="24"/>
-          <w:lang w:val="en-US"/>
-        </w:rPr>
-      </w:pPr>
-      <w:r>
-        <w:rPr>
-          <w:b/>
-          <w:bCs/>
-          <w:sz w:val="24"/>
-          <w:szCs w:val="24"/>
-          <w:lang w:val="bg-BG"/>
-        </w:rPr>
         <w:t>Информация:</w:t>
       </w:r>
       <w:r>
@@ -430,7 +393,21 @@
         <w:rPr>
           <w:b/>
           <w:bCs/>
-          <w:lang w:val="en-US"/>
+        </w:rPr>
+      </w:pPr>
+      <w:r>
+        <w:rPr>
+          <w:b/>
+          <w:bCs/>
+        </w:rPr>
+        <w:t>Участници:</w:t>
+      </w:r>
+    </w:p>
+    <w:p>
+      <w:pPr>
+        <w:rPr>
+          <w:sz w:val="24"/>
+          <w:szCs w:val="24"/>
         </w:rPr>
       </w:pPr>
     </w:p>
@@ -440,14 +417,78 @@
         <w:rPr>
           <w:b/>
           <w:bCs/>
-        </w:rPr>
-      </w:pPr>
-      <w:r>
-        <w:rPr>
-          <w:b/>
-          <w:bCs/>
-        </w:rPr>
-        <w:t>Участници:</w:t>
+          <w:sz w:val="24"/>
+          <w:szCs w:val="24"/>
+        </w:rPr>
+      </w:pPr>
+      <w:r>
+        <w:rPr>
+          <w:b/>
+          <w:bCs/>
+          <w:sz w:val="24"/>
+          <w:szCs w:val="24"/>
+        </w:rPr>
+        <w:t>Участник 1</w:t>
+      </w:r>
+    </w:p>
+    <w:p>
+      <w:pPr>
+        <w:rPr>
+          <w:sz w:val="24"/>
+          <w:szCs w:val="24"/>
+        </w:rPr>
+      </w:pPr>
+      <w:r>
+        <w:rPr>
+          <w:sz w:val="24"/>
+          <w:szCs w:val="24"/>
+        </w:rPr>
+        <w:t>Име, презиме, фамилия: Борис Димитров Ангелов</w:t>
+      </w:r>
+    </w:p>
+    <w:p>
+      <w:pPr>
+        <w:rPr>
+          <w:sz w:val="24"/>
+          <w:szCs w:val="24"/>
+        </w:rPr>
+      </w:pPr>
+      <w:r>
+        <w:rPr>
+          <w:sz w:val="24"/>
+          <w:szCs w:val="24"/>
+        </w:rPr>
+        <w:t>Клас: 9</w:t>
+      </w:r>
+    </w:p>
+    <w:p>
+      <w:pPr>
+        <w:rPr>
+          <w:sz w:val="24"/>
+          <w:szCs w:val="24"/>
+        </w:rPr>
+      </w:pPr>
+      <w:r>
+        <w:rPr>
+          <w:sz w:val="24"/>
+          <w:szCs w:val="24"/>
+        </w:rPr>
+        <w:t>Училище: ЧПГДН “СофтУни БУДИТЕЛ”</w:t>
+      </w:r>
+    </w:p>
+    <w:p>
+      <w:pPr>
+        <w:rPr>
+          <w:sz w:val="24"/>
+          <w:szCs w:val="24"/>
+        </w:rPr>
+      </w:pPr>
+      <w:r>
+        <w:rPr>
+          <w:sz w:val="24"/>
+          <w:szCs w:val="24"/>
+        </w:rPr>
+        <w:t>Град: София</w:t>
       </w:r>
     </w:p>
     <w:p>
@@ -475,22 +516,22 @@
           <w:sz w:val="24"/>
           <w:szCs w:val="24"/>
         </w:rPr>
-        <w:t>Участник 1</w:t>
-      </w:r>
-    </w:p>
-    <w:p>
-      <w:pPr>
-        <w:rPr>
-          <w:sz w:val="24"/>
-          <w:szCs w:val="24"/>
-        </w:rPr>
-      </w:pPr>
-      <w:r>
-        <w:rPr>
-          <w:sz w:val="24"/>
-          <w:szCs w:val="24"/>
-        </w:rPr>
-        <w:t>Име, презиме, фамилия: Борис Димитров Ангелов</w:t>
+        <w:t>Участник 2</w:t>
+      </w:r>
+    </w:p>
+    <w:p>
+      <w:pPr>
+        <w:rPr>
+          <w:sz w:val="24"/>
+          <w:szCs w:val="24"/>
+        </w:rPr>
+      </w:pPr>
+      <w:r>
+        <w:rPr>
+          <w:sz w:val="24"/>
+          <w:szCs w:val="24"/>
+        </w:rPr>
+        <w:t>Име, презиме, фамилия: Реджеб Мехмед Туджар</w:t>
       </w:r>
     </w:p>
     <w:p>
@@ -535,6 +576,7 @@
           <w:sz w:val="24"/>
           <w:szCs w:val="24"/>
         </w:rPr>
+        <w:lastRenderedPageBreak/>
         <w:t>Град: София</w:t>
       </w:r>
     </w:p>
@@ -563,37 +605,36 @@
           <w:sz w:val="24"/>
           <w:szCs w:val="24"/>
         </w:rPr>
-        <w:t>Участник 2</w:t>
-      </w:r>
-    </w:p>
-    <w:p>
-      <w:pPr>
-        <w:rPr>
-          <w:sz w:val="24"/>
-          <w:szCs w:val="24"/>
-        </w:rPr>
-      </w:pPr>
-      <w:r>
-        <w:rPr>
-          <w:sz w:val="24"/>
-          <w:szCs w:val="24"/>
-        </w:rPr>
-        <w:t>Име, презиме, фамилия: Реджеб Мехмед Туджар</w:t>
-      </w:r>
-    </w:p>
-    <w:p>
-      <w:pPr>
-        <w:rPr>
-          <w:sz w:val="24"/>
-          <w:szCs w:val="24"/>
-        </w:rPr>
-      </w:pPr>
-      <w:r>
-        <w:rPr>
-          <w:sz w:val="24"/>
-          <w:szCs w:val="24"/>
-        </w:rPr>
-        <w:lastRenderedPageBreak/>
+        <w:t>Участник 3</w:t>
+      </w:r>
+    </w:p>
+    <w:p>
+      <w:pPr>
+        <w:rPr>
+          <w:sz w:val="24"/>
+          <w:szCs w:val="24"/>
+        </w:rPr>
+      </w:pPr>
+      <w:r>
+        <w:rPr>
+          <w:sz w:val="24"/>
+          <w:szCs w:val="24"/>
+        </w:rPr>
+        <w:t>Име, презиме, фамилия: Адам Биков</w:t>
+      </w:r>
+    </w:p>
+    <w:p>
+      <w:pPr>
+        <w:rPr>
+          <w:sz w:val="24"/>
+          <w:szCs w:val="24"/>
+        </w:rPr>
+      </w:pPr>
+      <w:r>
+        <w:rPr>
+          <w:sz w:val="24"/>
+          <w:szCs w:val="24"/>
+        </w:rPr>
         <w:t>Клас: 9</w:t>
       </w:r>
     </w:p>
@@ -609,16 +650,84 @@
           <w:sz w:val="24"/>
           <w:szCs w:val="24"/>
         </w:rPr>
+        <w:t>Училище:  ЧПГДН “СофтУни БУДИТЕЛ”</w:t>
+      </w:r>
+    </w:p>
+    <w:p>
+      <w:r>
+        <w:rPr>
+          <w:sz w:val="24"/>
+          <w:szCs w:val="24"/>
+        </w:rPr>
+        <w:t>Град: София</w:t>
+      </w:r>
+    </w:p>
+    <w:p>
+      <w:pPr>
+        <w:pStyle w:val="2"/>
+        <w:rPr>
+          <w:b/>
+          <w:bCs/>
+          <w:sz w:val="24"/>
+          <w:szCs w:val="24"/>
+        </w:rPr>
+      </w:pPr>
+      <w:r>
+        <w:rPr>
+          <w:b/>
+          <w:bCs/>
+          <w:sz w:val="24"/>
+          <w:szCs w:val="24"/>
+        </w:rPr>
+        <w:t>Участник 4</w:t>
+      </w:r>
+    </w:p>
+    <w:p>
+      <w:pPr>
+        <w:rPr>
+          <w:sz w:val="24"/>
+          <w:szCs w:val="24"/>
+        </w:rPr>
+      </w:pPr>
+      <w:r>
+        <w:rPr>
+          <w:sz w:val="24"/>
+          <w:szCs w:val="24"/>
+        </w:rPr>
+        <w:t>Име, презиме, фамилия: Данислав Боянов Иванов</w:t>
+      </w:r>
+    </w:p>
+    <w:p>
+      <w:pPr>
+        <w:rPr>
+          <w:sz w:val="24"/>
+          <w:szCs w:val="24"/>
+        </w:rPr>
+      </w:pPr>
+      <w:r>
+        <w:rPr>
+          <w:sz w:val="24"/>
+          <w:szCs w:val="24"/>
+        </w:rPr>
+        <w:t>Клас: 9</w:t>
+      </w:r>
+    </w:p>
+    <w:p>
+      <w:pPr>
+        <w:rPr>
+          <w:sz w:val="24"/>
+          <w:szCs w:val="24"/>
+        </w:rPr>
+      </w:pPr>
+      <w:r>
+        <w:rPr>
+          <w:sz w:val="24"/>
+          <w:szCs w:val="24"/>
+        </w:rPr>
         <w:t>Училище: ЧПГДН “СофтУни БУДИТЕЛ”</w:t>
       </w:r>
     </w:p>
     <w:p>
-      <w:pPr>
-        <w:rPr>
-          <w:sz w:val="24"/>
-          <w:szCs w:val="24"/>
-        </w:rPr>
-      </w:pPr>
       <w:r>
         <w:rPr>
           <w:sz w:val="24"/>
@@ -629,14 +738,6 @@
     </w:p>
     <w:p>
       <w:pPr>
-        <w:rPr>
-          <w:sz w:val="24"/>
-          <w:szCs w:val="24"/>
-        </w:rPr>
-      </w:pPr>
-    </w:p>
-    <w:p>
-      <w:pPr>
         <w:pStyle w:val="2"/>
         <w:rPr>
           <w:b/>
@@ -645,29 +746,40 @@
           <w:szCs w:val="24"/>
         </w:rPr>
       </w:pPr>
-      <w:r>
-        <w:rPr>
-          <w:b/>
-          <w:bCs/>
-          <w:sz w:val="24"/>
-          <w:szCs w:val="24"/>
-        </w:rPr>
-        <w:t>Участник 3</w:t>
-      </w:r>
-    </w:p>
-    <w:p>
-      <w:pPr>
-        <w:rPr>
-          <w:sz w:val="24"/>
-          <w:szCs w:val="24"/>
-        </w:rPr>
-      </w:pPr>
-      <w:r>
-        <w:rPr>
-          <w:sz w:val="24"/>
-          <w:szCs w:val="24"/>
-        </w:rPr>
-        <w:t>Име, презиме, фамилия: Адам Биков</w:t>
+    </w:p>
+    <w:p>
+      <w:pPr>
+        <w:pStyle w:val="2"/>
+        <w:rPr>
+          <w:b/>
+          <w:bCs/>
+          <w:sz w:val="24"/>
+          <w:szCs w:val="24"/>
+        </w:rPr>
+      </w:pPr>
+      <w:r>
+        <w:rPr>
+          <w:b/>
+          <w:bCs/>
+          <w:sz w:val="24"/>
+          <w:szCs w:val="24"/>
+        </w:rPr>
+        <w:t>Участник 5</w:t>
+      </w:r>
+    </w:p>
+    <w:p>
+      <w:pPr>
+        <w:rPr>
+          <w:sz w:val="24"/>
+          <w:szCs w:val="24"/>
+        </w:rPr>
+      </w:pPr>
+      <w:r>
+        <w:rPr>
+          <w:sz w:val="24"/>
+          <w:szCs w:val="24"/>
+        </w:rPr>
+        <w:t>Име, презиме, фамилия: Кристиан Сталинов Петров</w:t>
       </w:r>
     </w:p>
     <w:p>
@@ -709,165 +821,7 @@
         <w:t>Град: София</w:t>
       </w:r>
     </w:p>
-    <w:p>
-      <w:pPr>
-        <w:pStyle w:val="2"/>
-        <w:rPr>
-          <w:b/>
-          <w:bCs/>
-          <w:sz w:val="24"/>
-          <w:szCs w:val="24"/>
-        </w:rPr>
-      </w:pPr>
-      <w:r>
-        <w:rPr>
-          <w:b/>
-          <w:bCs/>
-          <w:sz w:val="24"/>
-          <w:szCs w:val="24"/>
-        </w:rPr>
-        <w:t>Участник 4</w:t>
-      </w:r>
-    </w:p>
-    <w:p>
-      <w:pPr>
-        <w:rPr>
-          <w:sz w:val="24"/>
-          <w:szCs w:val="24"/>
-        </w:rPr>
-      </w:pPr>
-      <w:r>
-        <w:rPr>
-          <w:sz w:val="24"/>
-          <w:szCs w:val="24"/>
-        </w:rPr>
-        <w:t>Име, презиме, фамилия: Данислав Боянов Иванов</w:t>
-      </w:r>
-    </w:p>
-    <w:p>
-      <w:pPr>
-        <w:rPr>
-          <w:sz w:val="24"/>
-          <w:szCs w:val="24"/>
-        </w:rPr>
-      </w:pPr>
-      <w:r>
-        <w:rPr>
-          <w:sz w:val="24"/>
-          <w:szCs w:val="24"/>
-        </w:rPr>
-        <w:t>Клас: 9</w:t>
-      </w:r>
-    </w:p>
-    <w:p>
-      <w:pPr>
-        <w:rPr>
-          <w:sz w:val="24"/>
-          <w:szCs w:val="24"/>
-        </w:rPr>
-      </w:pPr>
-      <w:r>
-        <w:rPr>
-          <w:sz w:val="24"/>
-          <w:szCs w:val="24"/>
-        </w:rPr>
-        <w:t>Училище: ЧПГДН “СофтУни БУДИТЕЛ”</w:t>
-      </w:r>
-    </w:p>
-    <w:p>
-      <w:r>
-        <w:rPr>
-          <w:sz w:val="24"/>
-          <w:szCs w:val="24"/>
-        </w:rPr>
-        <w:t>Град: София</w:t>
-      </w:r>
-    </w:p>
-    <w:p>
-      <w:pPr>
-        <w:pStyle w:val="2"/>
-        <w:rPr>
-          <w:b/>
-          <w:bCs/>
-          <w:sz w:val="24"/>
-          <w:szCs w:val="24"/>
-        </w:rPr>
-      </w:pPr>
-    </w:p>
-    <w:p>
-      <w:pPr>
-        <w:pStyle w:val="2"/>
-        <w:rPr>
-          <w:b/>
-          <w:bCs/>
-          <w:sz w:val="24"/>
-          <w:szCs w:val="24"/>
-        </w:rPr>
-      </w:pPr>
-      <w:r>
-        <w:rPr>
-          <w:b/>
-          <w:bCs/>
-          <w:sz w:val="24"/>
-          <w:szCs w:val="24"/>
-        </w:rPr>
-        <w:t>Участник 5</w:t>
-      </w:r>
-    </w:p>
-    <w:p>
-      <w:pPr>
-        <w:rPr>
-          <w:sz w:val="24"/>
-          <w:szCs w:val="24"/>
-        </w:rPr>
-      </w:pPr>
-      <w:r>
-        <w:rPr>
-          <w:sz w:val="24"/>
-          <w:szCs w:val="24"/>
-        </w:rPr>
-        <w:t>Име, презиме, фамилия: Кристиан Сталинов Петров</w:t>
-      </w:r>
-    </w:p>
-    <w:p>
-      <w:pPr>
-        <w:rPr>
-          <w:sz w:val="24"/>
-          <w:szCs w:val="24"/>
-        </w:rPr>
-      </w:pPr>
-      <w:r>
-        <w:rPr>
-          <w:sz w:val="24"/>
-          <w:szCs w:val="24"/>
-        </w:rPr>
-        <w:t>Клас: 9</w:t>
-      </w:r>
-    </w:p>
-    <w:p>
-      <w:pPr>
-        <w:rPr>
-          <w:sz w:val="24"/>
-          <w:szCs w:val="24"/>
-        </w:rPr>
-      </w:pPr>
-      <w:r>
-        <w:rPr>
-          <w:sz w:val="24"/>
-          <w:szCs w:val="24"/>
-        </w:rPr>
-        <w:t>Училище:  ЧПГДН “СофтУни БУДИТЕЛ”</w:t>
-      </w:r>
-    </w:p>
-    <w:p>
-      <w:r>
-        <w:rPr>
-          <w:sz w:val="24"/>
-          <w:szCs w:val="24"/>
-        </w:rPr>
-        <w:t>Град: София</w:t>
-      </w:r>
-    </w:p>
+    <w:p/>
     <w:p/>
     <w:sectPr>
       <w:pgSz w:w="11906" w:h="16838"/>
@@ -1282,6 +1236,7 @@
     <w:name w:val="heading 1"/>
     <w:basedOn w:val="a"/>
     <w:next w:val="a"/>
+    <w:link w:val="10"/>
     <w:uiPriority w:val="9"/>
     <w:qFormat/>
     <w:pPr>
@@ -1300,6 +1255,7 @@
     <w:name w:val="heading 2"/>
     <w:basedOn w:val="a"/>
     <w:next w:val="a"/>
+    <w:link w:val="20"/>
     <w:uiPriority w:val="9"/>
     <w:unhideWhenUsed/>
     <w:qFormat/>
@@ -1506,6 +1462,30 @@
     <w:rPr>
       <w:color w:val="800080" w:themeColor="followedHyperlink"/>
       <w:u w:val="single"/>
+    </w:rPr>
+  </w:style>
+  <w:style w:type="character" w:customStyle="1" w:styleId="10">
+    <w:name w:val="Заглавие 1 Знак"/>
+    <w:basedOn w:val="a0"/>
+    <w:link w:val="1"/>
+    <w:uiPriority w:val="9"/>
+    <w:rsid w:val="00B86BAB"/>
+    <w:rPr>
+      <w:color w:val="2E75B5"/>
+      <w:sz w:val="32"/>
+      <w:szCs w:val="32"/>
+    </w:rPr>
+  </w:style>
+  <w:style w:type="character" w:customStyle="1" w:styleId="20">
+    <w:name w:val="Заглавие 2 Знак"/>
+    <w:basedOn w:val="a0"/>
+    <w:link w:val="2"/>
+    <w:uiPriority w:val="9"/>
+    <w:rsid w:val="00B86BAB"/>
+    <w:rPr>
+      <w:color w:val="2E75B5"/>
+      <w:sz w:val="26"/>
+      <w:szCs w:val="26"/>
     </w:rPr>
   </w:style>
 </w:styles>

</xml_diff>